<commit_message>
Explain neuron activations in the two "inside the model" notebooks
Lab 1 Part 2 and 2S-2 (and their solutions):
- "What is an activation?" box at the layer-by-layer step; bar plots
  labelled as activations; readings explain silent neurons.
- 3.1 Same weights, different activations: two contrasting cases side by
  side (Sat 13 Sep vs the day after the 26 Nov strike; foggy New Year's
  Eve vs a clear summer afternoon).
- 3.2 What does a neuron react to?: average activations over all days or
  hours, the detector neurons found automatically ("quiet/busy
  yesterday"; "fog-prone conditions"), their weights and behaviour, with a
  caveat that most neurons are not this easy to name.
- New optional coding challenge in each notebook.
- Time per notebook now about 1 hour; README and documents updated.

Co-Authored-By: Claude Opus 5.5 <noreply@anthropic.com>
Claude-Session: https://claude.ai/code/session_01T8ves2m2YhbnkRZGCkgsnW
</commit_message>
<xml_diff>
--- a/docs/AI_Lab_Colab_Instructions.docx
+++ b/docs/AI_Lab_Colab_Instructions.docx
@@ -1620,7 +1620,7 @@
       <w:pPr>
         <w:spacing w:after="120"/>
       </w:pPr>
-      <w:hyperlink w:history="1" r:id="rIdmw3nmgybyjjfki-5pdbx1">
+      <w:hyperlink w:history="1" r:id="rIdf2cpibb3wby0qqfsu-zl4">
         <w:r>
           <w:rPr>
             <w:rStyle w:val="Hyperlink"/>
@@ -1848,7 +1848,7 @@
             <w:pPr>
               <w:spacing w:after="20"/>
             </w:pPr>
-            <w:hyperlink w:history="1" r:id="rIdwvwhuhrsb4a_lbx4nzwm5">
+            <w:hyperlink w:history="1" r:id="rIdt4oegfz0yn9fp7wys0m_s">
               <w:r>
                 <w:rPr>
                   <w:rStyle w:val="Hyperlink"/>
@@ -1925,7 +1925,7 @@
                 <w:sz w:val="19"/>
                 <w:szCs w:val="19"/>
               </w:rPr>
-              <w:t xml:space="preserve">50 min</w:t>
+              <w:t xml:space="preserve">1 h</w:t>
             </w:r>
           </w:p>
         </w:tc>
@@ -1949,7 +1949,7 @@
             <w:pPr>
               <w:spacing w:after="20"/>
             </w:pPr>
-            <w:hyperlink w:history="1" r:id="rIdnubhvrzzlfwdhmvosx6r3">
+            <w:hyperlink w:history="1" r:id="rIduurc9ghhfxxmj2dvftyoe">
               <w:r>
                 <w:rPr>
                   <w:rStyle w:val="Hyperlink"/>
@@ -2050,7 +2050,7 @@
             <w:pPr>
               <w:spacing w:after="20"/>
             </w:pPr>
-            <w:hyperlink w:history="1" r:id="rIdhwfz5w1pzgnt7c8ofgr0u">
+            <w:hyperlink w:history="1" r:id="rIdzr6bxxgim53chbkrv_0q_">
               <w:r>
                 <w:rPr>
                   <w:rStyle w:val="Hyperlink"/>
@@ -2151,7 +2151,7 @@
             <w:pPr>
               <w:spacing w:after="20"/>
             </w:pPr>
-            <w:hyperlink w:history="1" r:id="rIdzq5wjgsa_1xrlym2f2mbl">
+            <w:hyperlink w:history="1" r:id="rIdflkvinn2wzi3b54xkmm1r">
               <w:r>
                 <w:rPr>
                   <w:rStyle w:val="Hyperlink"/>
@@ -2252,7 +2252,7 @@
             <w:pPr>
               <w:spacing w:after="20"/>
             </w:pPr>
-            <w:hyperlink w:history="1" r:id="rIds-fygcnfhkmowcrk6xcf3">
+            <w:hyperlink w:history="1" r:id="rIdsmndltaudg-jnyhz5rwul">
               <w:r>
                 <w:rPr>
                   <w:rStyle w:val="Hyperlink"/>
@@ -2353,7 +2353,7 @@
             <w:pPr>
               <w:spacing w:after="20"/>
             </w:pPr>
-            <w:hyperlink w:history="1" r:id="rIdk2is4h_xnp26z9esykim3">
+            <w:hyperlink w:history="1" r:id="rIdfmyaerdxfn9k6hmtbvpmb">
               <w:r>
                 <w:rPr>
                   <w:rStyle w:val="Hyperlink"/>
@@ -2454,7 +2454,7 @@
             <w:pPr>
               <w:spacing w:after="20"/>
             </w:pPr>
-            <w:hyperlink w:history="1" r:id="rIdahpgf-1p1hmj8dzvttnfk">
+            <w:hyperlink w:history="1" r:id="rIduvzboick_0ji3o4zcm3bu">
               <w:r>
                 <w:rPr>
                   <w:rStyle w:val="Hyperlink"/>
@@ -2531,7 +2531,7 @@
                 <w:sz w:val="19"/>
                 <w:szCs w:val="19"/>
               </w:rPr>
-              <w:t xml:space="preserve">50 min</w:t>
+              <w:t xml:space="preserve">1 h</w:t>
             </w:r>
           </w:p>
         </w:tc>
@@ -2555,7 +2555,7 @@
             <w:pPr>
               <w:spacing w:after="20"/>
             </w:pPr>
-            <w:hyperlink w:history="1" r:id="rIdl_jg6ur31_v2dynuy1nvt">
+            <w:hyperlink w:history="1" r:id="rIdlbewoavdkmrpx1so3dehr">
               <w:r>
                 <w:rPr>
                   <w:rStyle w:val="Hyperlink"/>
@@ -2656,7 +2656,7 @@
             <w:pPr>
               <w:spacing w:after="20"/>
             </w:pPr>
-            <w:hyperlink w:history="1" r:id="rIdn-dmwdokrsztenrpkiaro">
+            <w:hyperlink w:history="1" r:id="rId7lxeoybpjarnuakif0vze">
               <w:r>
                 <w:rPr>
                   <w:rStyle w:val="Hyperlink"/>
@@ -2876,7 +2876,7 @@
             <w:pPr>
               <w:spacing w:after="20"/>
             </w:pPr>
-            <w:hyperlink w:history="1" r:id="rIdahokl6igqtk2ph_h7mkua">
+            <w:hyperlink w:history="1" r:id="rIddffxmgqb-e4ajvaurc0jk">
               <w:r>
                 <w:rPr>
                   <w:rStyle w:val="Hyperlink"/>
@@ -2961,7 +2961,7 @@
             <w:pPr>
               <w:spacing w:after="20"/>
             </w:pPr>
-            <w:hyperlink w:history="1" r:id="rIdnhutskwy63qqsg_86qb4k">
+            <w:hyperlink w:history="1" r:id="rIdfc5dybq94ruyoxs0sohyo">
               <w:r>
                 <w:rPr>
                   <w:rStyle w:val="Hyperlink"/>
@@ -3046,7 +3046,7 @@
             <w:pPr>
               <w:spacing w:after="20"/>
             </w:pPr>
-            <w:hyperlink w:history="1" r:id="rIdmpacippfb6dertma5iwbk">
+            <w:hyperlink w:history="1" r:id="rIdieuabtdanzsfcuz7x3e2g">
               <w:r>
                 <w:rPr>
                   <w:rStyle w:val="Hyperlink"/>
@@ -3131,7 +3131,7 @@
             <w:pPr>
               <w:spacing w:after="20"/>
             </w:pPr>
-            <w:hyperlink w:history="1" r:id="rIdytwlm0affhvvndqk1rqsb">
+            <w:hyperlink w:history="1" r:id="rIddkquau96yhjqcen4z9gpv">
               <w:r>
                 <w:rPr>
                   <w:rStyle w:val="Hyperlink"/>
@@ -3216,7 +3216,7 @@
             <w:pPr>
               <w:spacing w:after="20"/>
             </w:pPr>
-            <w:hyperlink w:history="1" r:id="rIdjtjj-qccjucunh1n8_s4f">
+            <w:hyperlink w:history="1" r:id="rId8e9-gq61jelliy6qbd0e-">
               <w:r>
                 <w:rPr>
                   <w:rStyle w:val="Hyperlink"/>

</xml_diff>